<commit_message>
Checkpoint author dissertation edits before full DOCX build
</commit_message>
<xml_diff>
--- a/论文对比资料_2026-08-23/08_直白表达与完整图表论文_2026-08-24/用户修改原稿_前三章文字版_2026-08-24.docx
+++ b/论文对比资料_2026-08-23/08_直白表达与完整图表论文_2026-08-24/用户修改原稿_前三章文字版_2026-08-24.docx
@@ -963,7 +963,6 @@
     <w:p>
       <w:pPr>
         <w:rPr>
-          <w:rFonts w:hint="eastAsia"/>
           <w:lang w:eastAsia="zh-CN"/>
         </w:rPr>
       </w:pPr>
@@ -1033,7 +1032,6 @@
     <w:p>
       <w:pPr>
         <w:rPr>
-          <w:rFonts w:hint="eastAsia"/>
           <w:lang w:eastAsia="zh-CN"/>
         </w:rPr>
       </w:pPr>
@@ -1068,7 +1066,6 @@
     <w:p>
       <w:pPr>
         <w:rPr>
-          <w:rFonts w:hint="eastAsia"/>
           <w:lang w:eastAsia="zh-CN"/>
         </w:rPr>
       </w:pPr>
@@ -1104,7 +1101,6 @@
     <w:p>
       <w:pPr>
         <w:rPr>
-          <w:rFonts w:hint="eastAsia"/>
           <w:lang w:eastAsia="zh-CN"/>
         </w:rPr>
       </w:pPr>
@@ -1181,7 +1177,6 @@
     <w:p>
       <w:pPr>
         <w:rPr>
-          <w:rFonts w:hint="eastAsia"/>
           <w:lang w:eastAsia="zh-CN"/>
         </w:rPr>
       </w:pPr>
@@ -1442,59 +1437,59 @@
         <w:rPr>
           <w:lang w:eastAsia="zh-CN"/>
         </w:rPr>
-        <w:t>4.7</w:t>
-      </w:r>
-      <w:r>
-        <w:rPr>
-          <w:lang w:eastAsia="zh-CN"/>
-        </w:rPr>
-        <w:t xml:space="preserve">　物理屏幕实验基础设施</w:t>
+        <w:t>4.8</w:t>
+      </w:r>
+      <w:r>
+        <w:rPr>
+          <w:lang w:eastAsia="zh-CN"/>
+        </w:rPr>
+        <w:t xml:space="preserve">　演示游戏</w:t>
       </w:r>
     </w:p>
     <w:p>
       <w:pPr>
-        <w:pStyle w:val="21"/>
-        <w:rPr>
-          <w:lang w:eastAsia="zh-CN"/>
-        </w:rPr>
-      </w:pPr>
-      <w:r>
-        <w:rPr>
-          <w:lang w:eastAsia="zh-CN"/>
-        </w:rPr>
-        <w:t>4.8</w:t>
-      </w:r>
-      <w:r>
-        <w:rPr>
-          <w:lang w:eastAsia="zh-CN"/>
-        </w:rPr>
-        <w:t xml:space="preserve">　演示游戏</w:t>
+        <w:pStyle w:val="1"/>
+        <w:rPr>
+          <w:lang w:eastAsia="zh-CN"/>
+        </w:rPr>
+      </w:pPr>
+      <w:r>
+        <w:rPr>
+          <w:lang w:eastAsia="zh-CN"/>
+        </w:rPr>
+        <w:t>第</w:t>
+      </w:r>
+      <w:r>
+        <w:rPr>
+          <w:lang w:eastAsia="zh-CN"/>
+        </w:rPr>
+        <w:t>5</w:t>
+      </w:r>
+      <w:r>
+        <w:rPr>
+          <w:lang w:eastAsia="zh-CN"/>
+        </w:rPr>
+        <w:t>章　结果与分析</w:t>
       </w:r>
     </w:p>
     <w:p>
       <w:pPr>
-        <w:pStyle w:val="1"/>
-        <w:rPr>
-          <w:lang w:eastAsia="zh-CN"/>
-        </w:rPr>
-      </w:pPr>
-      <w:r>
-        <w:rPr>
-          <w:lang w:eastAsia="zh-CN"/>
-        </w:rPr>
-        <w:t>第</w:t>
-      </w:r>
-      <w:r>
-        <w:rPr>
-          <w:lang w:eastAsia="zh-CN"/>
-        </w:rPr>
-        <w:t>5</w:t>
-      </w:r>
-      <w:r>
-        <w:rPr>
-          <w:lang w:eastAsia="zh-CN"/>
-        </w:rPr>
-        <w:t>章　结果与分析</w:t>
+        <w:pStyle w:val="21"/>
+        <w:rPr>
+          <w:lang w:eastAsia="zh-CN"/>
+        </w:rPr>
+      </w:pPr>
+      <w:r>
+        <w:rPr>
+          <w:lang w:eastAsia="zh-CN"/>
+        </w:rPr>
+        <w:t>5.1</w:t>
+      </w:r>
+      <w:r>
+        <w:rPr>
+          <w:lang w:eastAsia="zh-CN"/>
+        </w:rPr>
+        <w:t xml:space="preserve">　功能正确性</w:t>
       </w:r>
     </w:p>
     <w:p>
@@ -1508,13 +1503,13 @@
         <w:rPr>
           <w:lang w:eastAsia="zh-CN"/>
         </w:rPr>
-        <w:t>5.1</w:t>
-      </w:r>
-      <w:r>
-        <w:rPr>
-          <w:lang w:eastAsia="zh-CN"/>
-        </w:rPr>
-        <w:t xml:space="preserve">　功能正确性</w:t>
+        <w:t>5.2</w:t>
+      </w:r>
+      <w:r>
+        <w:rPr>
+          <w:lang w:eastAsia="zh-CN"/>
+        </w:rPr>
+        <w:t xml:space="preserve">　受控多规模显示结果</w:t>
       </w:r>
     </w:p>
     <w:p>
@@ -1528,13 +1523,13 @@
         <w:rPr>
           <w:lang w:eastAsia="zh-CN"/>
         </w:rPr>
-        <w:t>5.2</w:t>
-      </w:r>
-      <w:r>
-        <w:rPr>
-          <w:lang w:eastAsia="zh-CN"/>
-        </w:rPr>
-        <w:t xml:space="preserve">　受控多规模显示结果</w:t>
+        <w:t>5.3</w:t>
+      </w:r>
+      <w:r>
+        <w:rPr>
+          <w:lang w:eastAsia="zh-CN"/>
+        </w:rPr>
+        <w:t xml:space="preserve">　物理屏幕尺寸结果</w:t>
       </w:r>
     </w:p>
     <w:p>
@@ -1548,13 +1543,13 @@
         <w:rPr>
           <w:lang w:eastAsia="zh-CN"/>
         </w:rPr>
-        <w:t>5.3</w:t>
-      </w:r>
-      <w:r>
-        <w:rPr>
-          <w:lang w:eastAsia="zh-CN"/>
-        </w:rPr>
-        <w:t xml:space="preserve">　物理屏幕尺寸结果</w:t>
+        <w:t>5.4</w:t>
+      </w:r>
+      <w:r>
+        <w:rPr>
+          <w:lang w:eastAsia="zh-CN"/>
+        </w:rPr>
+        <w:t xml:space="preserve">　版本化拖拽交互结果</w:t>
       </w:r>
     </w:p>
     <w:p>
@@ -1568,13 +1563,25 @@
         <w:rPr>
           <w:lang w:eastAsia="zh-CN"/>
         </w:rPr>
-        <w:t>5.4</w:t>
-      </w:r>
-      <w:r>
-        <w:rPr>
-          <w:lang w:eastAsia="zh-CN"/>
-        </w:rPr>
-        <w:t xml:space="preserve">　版本化拖拽交互结果</w:t>
+        <w:t>5.5</w:t>
+      </w:r>
+      <w:r>
+        <w:rPr>
+          <w:lang w:eastAsia="zh-CN"/>
+        </w:rPr>
+        <w:t xml:space="preserve">　可玩</w:t>
+      </w:r>
+      <w:r>
+        <w:rPr>
+          <w:lang w:eastAsia="zh-CN"/>
+        </w:rPr>
+        <w:t xml:space="preserve"> 241 </w:t>
+      </w:r>
+      <w:r>
+        <w:rPr>
+          <w:lang w:eastAsia="zh-CN"/>
+        </w:rPr>
+        <w:t>节点树显示结果</w:t>
       </w:r>
     </w:p>
     <w:p>
@@ -1588,25 +1595,13 @@
         <w:rPr>
           <w:lang w:eastAsia="zh-CN"/>
         </w:rPr>
-        <w:t>5.5</w:t>
-      </w:r>
-      <w:r>
-        <w:rPr>
-          <w:lang w:eastAsia="zh-CN"/>
-        </w:rPr>
-        <w:t xml:space="preserve">　可玩</w:t>
-      </w:r>
-      <w:r>
-        <w:rPr>
-          <w:lang w:eastAsia="zh-CN"/>
-        </w:rPr>
-        <w:t xml:space="preserve"> 241 </w:t>
-      </w:r>
-      <w:r>
-        <w:rPr>
-          <w:lang w:eastAsia="zh-CN"/>
-        </w:rPr>
-        <w:t>节点树显示结果</w:t>
+        <w:t>5.6</w:t>
+      </w:r>
+      <w:r>
+        <w:rPr>
+          <w:lang w:eastAsia="zh-CN"/>
+        </w:rPr>
+        <w:t xml:space="preserve">　路径与概览结果</w:t>
       </w:r>
     </w:p>
     <w:p>
@@ -1621,13 +1616,13 @@
           <w:lang w:eastAsia="zh-CN"/>
         </w:rPr>
         <w:lastRenderedPageBreak/>
-        <w:t>5.6</w:t>
-      </w:r>
-      <w:r>
-        <w:rPr>
-          <w:lang w:eastAsia="zh-CN"/>
-        </w:rPr>
-        <w:t xml:space="preserve">　路径与概览结果</w:t>
+        <w:t>5.7</w:t>
+      </w:r>
+      <w:r>
+        <w:rPr>
+          <w:lang w:eastAsia="zh-CN"/>
+        </w:rPr>
+        <w:t xml:space="preserve">　视觉回归发现</w:t>
       </w:r>
     </w:p>
     <w:p>
@@ -1641,13 +1636,13 @@
         <w:rPr>
           <w:lang w:eastAsia="zh-CN"/>
         </w:rPr>
-        <w:t>5.7</w:t>
-      </w:r>
-      <w:r>
-        <w:rPr>
-          <w:lang w:eastAsia="zh-CN"/>
-        </w:rPr>
-        <w:t xml:space="preserve">　视觉回归发现</w:t>
+        <w:t>5.8</w:t>
+      </w:r>
+      <w:r>
+        <w:rPr>
+          <w:lang w:eastAsia="zh-CN"/>
+        </w:rPr>
+        <w:t xml:space="preserve">　人体可用性证据边界</w:t>
       </w:r>
     </w:p>
     <w:p>
@@ -1661,59 +1656,59 @@
         <w:rPr>
           <w:lang w:eastAsia="zh-CN"/>
         </w:rPr>
-        <w:t>5.8</w:t>
-      </w:r>
-      <w:r>
-        <w:rPr>
-          <w:lang w:eastAsia="zh-CN"/>
-        </w:rPr>
-        <w:t xml:space="preserve">　人体可用性证据边界</w:t>
+        <w:t>5.9</w:t>
+      </w:r>
+      <w:r>
+        <w:rPr>
+          <w:lang w:eastAsia="zh-CN"/>
+        </w:rPr>
+        <w:t xml:space="preserve">　对应研究问题的结果</w:t>
       </w:r>
     </w:p>
     <w:p>
       <w:pPr>
-        <w:pStyle w:val="21"/>
-        <w:rPr>
-          <w:lang w:eastAsia="zh-CN"/>
-        </w:rPr>
-      </w:pPr>
-      <w:r>
-        <w:rPr>
-          <w:lang w:eastAsia="zh-CN"/>
-        </w:rPr>
-        <w:t>5.9</w:t>
-      </w:r>
-      <w:r>
-        <w:rPr>
-          <w:lang w:eastAsia="zh-CN"/>
-        </w:rPr>
-        <w:t xml:space="preserve">　对应研究问题的结果</w:t>
+        <w:pStyle w:val="1"/>
+        <w:rPr>
+          <w:lang w:eastAsia="zh-CN"/>
+        </w:rPr>
+      </w:pPr>
+      <w:r>
+        <w:rPr>
+          <w:lang w:eastAsia="zh-CN"/>
+        </w:rPr>
+        <w:t>第</w:t>
+      </w:r>
+      <w:r>
+        <w:rPr>
+          <w:lang w:eastAsia="zh-CN"/>
+        </w:rPr>
+        <w:t>6</w:t>
+      </w:r>
+      <w:r>
+        <w:rPr>
+          <w:lang w:eastAsia="zh-CN"/>
+        </w:rPr>
+        <w:t>章　讨论</w:t>
       </w:r>
     </w:p>
     <w:p>
       <w:pPr>
-        <w:pStyle w:val="1"/>
-        <w:rPr>
-          <w:lang w:eastAsia="zh-CN"/>
-        </w:rPr>
-      </w:pPr>
-      <w:r>
-        <w:rPr>
-          <w:lang w:eastAsia="zh-CN"/>
-        </w:rPr>
-        <w:t>第</w:t>
-      </w:r>
-      <w:r>
-        <w:rPr>
-          <w:lang w:eastAsia="zh-CN"/>
-        </w:rPr>
-        <w:t>6</w:t>
-      </w:r>
-      <w:r>
-        <w:rPr>
-          <w:lang w:eastAsia="zh-CN"/>
-        </w:rPr>
-        <w:t>章　讨论</w:t>
+        <w:pStyle w:val="21"/>
+        <w:rPr>
+          <w:lang w:eastAsia="zh-CN"/>
+        </w:rPr>
+      </w:pPr>
+      <w:r>
+        <w:rPr>
+          <w:lang w:eastAsia="zh-CN"/>
+        </w:rPr>
+        <w:t>6.1</w:t>
+      </w:r>
+      <w:r>
+        <w:rPr>
+          <w:lang w:eastAsia="zh-CN"/>
+        </w:rPr>
+        <w:t xml:space="preserve">　实验平台的正确性与边界</w:t>
       </w:r>
     </w:p>
     <w:p>
@@ -1727,13 +1722,13 @@
         <w:rPr>
           <w:lang w:eastAsia="zh-CN"/>
         </w:rPr>
-        <w:t>6.1</w:t>
-      </w:r>
-      <w:r>
-        <w:rPr>
-          <w:lang w:eastAsia="zh-CN"/>
-        </w:rPr>
-        <w:t xml:space="preserve">　实验平台的正确性与边界</w:t>
+        <w:t>6.2</w:t>
+      </w:r>
+      <w:r>
+        <w:rPr>
+          <w:lang w:eastAsia="zh-CN"/>
+        </w:rPr>
+        <w:t xml:space="preserve">　显示结果的解释</w:t>
       </w:r>
     </w:p>
     <w:p>
@@ -1747,13 +1742,25 @@
         <w:rPr>
           <w:lang w:eastAsia="zh-CN"/>
         </w:rPr>
-        <w:t>6.2</w:t>
-      </w:r>
-      <w:r>
-        <w:rPr>
-          <w:lang w:eastAsia="zh-CN"/>
-        </w:rPr>
-        <w:t xml:space="preserve">　显示结果的解释</w:t>
+        <w:t>6.3</w:t>
+      </w:r>
+      <w:r>
+        <w:rPr>
+          <w:lang w:eastAsia="zh-CN"/>
+        </w:rPr>
+        <w:t xml:space="preserve">　</w:t>
+      </w:r>
+      <w:r>
+        <w:rPr>
+          <w:lang w:eastAsia="zh-CN"/>
+        </w:rPr>
+        <w:t xml:space="preserve">Live Debug </w:t>
+      </w:r>
+      <w:r>
+        <w:rPr>
+          <w:lang w:eastAsia="zh-CN"/>
+        </w:rPr>
+        <w:t>作为可读性机制</w:t>
       </w:r>
     </w:p>
     <w:p>
@@ -1767,25 +1774,13 @@
         <w:rPr>
           <w:lang w:eastAsia="zh-CN"/>
         </w:rPr>
-        <w:t>6.3</w:t>
-      </w:r>
-      <w:r>
-        <w:rPr>
-          <w:lang w:eastAsia="zh-CN"/>
-        </w:rPr>
-        <w:t xml:space="preserve">　</w:t>
-      </w:r>
-      <w:r>
-        <w:rPr>
-          <w:lang w:eastAsia="zh-CN"/>
-        </w:rPr>
-        <w:t xml:space="preserve">Live Debug </w:t>
-      </w:r>
-      <w:r>
-        <w:rPr>
-          <w:lang w:eastAsia="zh-CN"/>
-        </w:rPr>
-        <w:t>作为可读性机制</w:t>
+        <w:t>6.4</w:t>
+      </w:r>
+      <w:r>
+        <w:rPr>
+          <w:lang w:eastAsia="zh-CN"/>
+        </w:rPr>
+        <w:t xml:space="preserve">　可靠性与发布</w:t>
       </w:r>
     </w:p>
     <w:p>
@@ -1799,33 +1794,33 @@
         <w:rPr>
           <w:lang w:eastAsia="zh-CN"/>
         </w:rPr>
-        <w:t>6.4</w:t>
-      </w:r>
-      <w:r>
-        <w:rPr>
-          <w:lang w:eastAsia="zh-CN"/>
-        </w:rPr>
-        <w:t xml:space="preserve">　可靠性与发布</w:t>
+        <w:t>6.5</w:t>
+      </w:r>
+      <w:r>
+        <w:rPr>
+          <w:lang w:eastAsia="zh-CN"/>
+        </w:rPr>
+        <w:t xml:space="preserve">　有效性威胁</w:t>
       </w:r>
     </w:p>
     <w:p>
       <w:pPr>
-        <w:pStyle w:val="21"/>
-        <w:rPr>
-          <w:lang w:eastAsia="zh-CN"/>
-        </w:rPr>
-      </w:pPr>
-      <w:r>
-        <w:rPr>
-          <w:lang w:eastAsia="zh-CN"/>
-        </w:rPr>
-        <w:t>6.5</w:t>
-      </w:r>
-      <w:r>
-        <w:rPr>
-          <w:lang w:eastAsia="zh-CN"/>
-        </w:rPr>
-        <w:t xml:space="preserve">　有效性威胁</w:t>
+        <w:pStyle w:val="31"/>
+        <w:rPr>
+          <w:lang w:eastAsia="zh-CN"/>
+        </w:rPr>
+      </w:pPr>
+      <w:r>
+        <w:rPr>
+          <w:lang w:eastAsia="zh-CN"/>
+        </w:rPr>
+        <w:t>6.5.1</w:t>
+      </w:r>
+      <w:r>
+        <w:rPr>
+          <w:lang w:eastAsia="zh-CN"/>
+        </w:rPr>
+        <w:t xml:space="preserve">　构念有效性</w:t>
       </w:r>
     </w:p>
     <w:p>
@@ -1839,13 +1834,13 @@
         <w:rPr>
           <w:lang w:eastAsia="zh-CN"/>
         </w:rPr>
-        <w:t>6.5.1</w:t>
-      </w:r>
-      <w:r>
-        <w:rPr>
-          <w:lang w:eastAsia="zh-CN"/>
-        </w:rPr>
-        <w:t xml:space="preserve">　构念有效性</w:t>
+        <w:t>6.5.2</w:t>
+      </w:r>
+      <w:r>
+        <w:rPr>
+          <w:lang w:eastAsia="zh-CN"/>
+        </w:rPr>
+        <w:t xml:space="preserve">　内部有效性</w:t>
       </w:r>
     </w:p>
     <w:p>
@@ -1859,13 +1854,13 @@
         <w:rPr>
           <w:lang w:eastAsia="zh-CN"/>
         </w:rPr>
-        <w:t>6.5.2</w:t>
-      </w:r>
-      <w:r>
-        <w:rPr>
-          <w:lang w:eastAsia="zh-CN"/>
-        </w:rPr>
-        <w:t xml:space="preserve">　内部有效性</w:t>
+        <w:t>6.5.3</w:t>
+      </w:r>
+      <w:r>
+        <w:rPr>
+          <w:lang w:eastAsia="zh-CN"/>
+        </w:rPr>
+        <w:t xml:space="preserve">　外部有效性</w:t>
       </w:r>
     </w:p>
     <w:p>
@@ -1879,79 +1874,79 @@
         <w:rPr>
           <w:lang w:eastAsia="zh-CN"/>
         </w:rPr>
-        <w:t>6.5.3</w:t>
-      </w:r>
-      <w:r>
-        <w:rPr>
-          <w:lang w:eastAsia="zh-CN"/>
-        </w:rPr>
-        <w:t xml:space="preserve">　外部有效性</w:t>
+        <w:t>6.5.4</w:t>
+      </w:r>
+      <w:r>
+        <w:rPr>
+          <w:lang w:eastAsia="zh-CN"/>
+        </w:rPr>
+        <w:t xml:space="preserve">　研究者与人体有效性边界</w:t>
       </w:r>
     </w:p>
     <w:p>
       <w:pPr>
-        <w:pStyle w:val="31"/>
-        <w:rPr>
-          <w:lang w:eastAsia="zh-CN"/>
-        </w:rPr>
-      </w:pPr>
-      <w:r>
-        <w:rPr>
-          <w:lang w:eastAsia="zh-CN"/>
-        </w:rPr>
-        <w:t>6.5.4</w:t>
-      </w:r>
-      <w:r>
-        <w:rPr>
-          <w:lang w:eastAsia="zh-CN"/>
-        </w:rPr>
-        <w:t xml:space="preserve">　研究者与人体有效性边界</w:t>
+        <w:pStyle w:val="21"/>
+        <w:rPr>
+          <w:lang w:eastAsia="zh-CN"/>
+        </w:rPr>
+      </w:pPr>
+      <w:r>
+        <w:rPr>
+          <w:lang w:eastAsia="zh-CN"/>
+        </w:rPr>
+        <w:t>6.6</w:t>
+      </w:r>
+      <w:r>
+        <w:rPr>
+          <w:lang w:eastAsia="zh-CN"/>
+        </w:rPr>
+        <w:t xml:space="preserve">　实践启示</w:t>
       </w:r>
     </w:p>
     <w:p>
       <w:pPr>
-        <w:pStyle w:val="21"/>
-        <w:rPr>
-          <w:lang w:eastAsia="zh-CN"/>
-        </w:rPr>
-      </w:pPr>
-      <w:r>
-        <w:rPr>
-          <w:lang w:eastAsia="zh-CN"/>
-        </w:rPr>
-        <w:t>6.6</w:t>
-      </w:r>
-      <w:r>
-        <w:rPr>
-          <w:lang w:eastAsia="zh-CN"/>
-        </w:rPr>
-        <w:t xml:space="preserve">　实践启示</w:t>
+        <w:pStyle w:val="1"/>
+        <w:rPr>
+          <w:lang w:eastAsia="zh-CN"/>
+        </w:rPr>
+      </w:pPr>
+      <w:r>
+        <w:rPr>
+          <w:lang w:eastAsia="zh-CN"/>
+        </w:rPr>
+        <w:t>第</w:t>
+      </w:r>
+      <w:r>
+        <w:rPr>
+          <w:lang w:eastAsia="zh-CN"/>
+        </w:rPr>
+        <w:t>7</w:t>
+      </w:r>
+      <w:r>
+        <w:rPr>
+          <w:lang w:eastAsia="zh-CN"/>
+        </w:rPr>
+        <w:t>章　结论</w:t>
       </w:r>
     </w:p>
     <w:p>
       <w:pPr>
-        <w:pStyle w:val="1"/>
-        <w:rPr>
-          <w:lang w:eastAsia="zh-CN"/>
-        </w:rPr>
-      </w:pPr>
-      <w:r>
-        <w:rPr>
-          <w:lang w:eastAsia="zh-CN"/>
-        </w:rPr>
-        <w:t>第</w:t>
-      </w:r>
-      <w:r>
-        <w:rPr>
-          <w:lang w:eastAsia="zh-CN"/>
-        </w:rPr>
-        <w:t>7</w:t>
-      </w:r>
-      <w:r>
-        <w:rPr>
-          <w:lang w:eastAsia="zh-CN"/>
-        </w:rPr>
-        <w:t>章　结论</w:t>
+        <w:pStyle w:val="21"/>
+        <w:rPr>
+          <w:lang w:eastAsia="zh-CN"/>
+        </w:rPr>
+      </w:pPr>
+      <w:r>
+        <w:rPr>
+          <w:lang w:eastAsia="zh-CN"/>
+        </w:rPr>
+        <w:t>7.1</w:t>
+      </w:r>
+      <w:r>
+        <w:rPr>
+          <w:lang w:eastAsia="zh-CN"/>
+        </w:rPr>
+        <w:t xml:space="preserve">　总结</w:t>
       </w:r>
     </w:p>
     <w:p>
@@ -1965,13 +1960,13 @@
         <w:rPr>
           <w:lang w:eastAsia="zh-CN"/>
         </w:rPr>
-        <w:t>7.1</w:t>
-      </w:r>
-      <w:r>
-        <w:rPr>
-          <w:lang w:eastAsia="zh-CN"/>
-        </w:rPr>
-        <w:t xml:space="preserve">　总结</w:t>
+        <w:t>7.2</w:t>
+      </w:r>
+      <w:r>
+        <w:rPr>
+          <w:lang w:eastAsia="zh-CN"/>
+        </w:rPr>
+        <w:t xml:space="preserve">　贡献</w:t>
       </w:r>
     </w:p>
     <w:p>
@@ -1985,13 +1980,13 @@
         <w:rPr>
           <w:lang w:eastAsia="zh-CN"/>
         </w:rPr>
-        <w:t>7.2</w:t>
-      </w:r>
-      <w:r>
-        <w:rPr>
-          <w:lang w:eastAsia="zh-CN"/>
-        </w:rPr>
-        <w:t xml:space="preserve">　贡献</w:t>
+        <w:t>7.3</w:t>
+      </w:r>
+      <w:r>
+        <w:rPr>
+          <w:lang w:eastAsia="zh-CN"/>
+        </w:rPr>
+        <w:t xml:space="preserve">　局限</w:t>
       </w:r>
     </w:p>
     <w:p>
@@ -2005,14 +2000,13 @@
         <w:rPr>
           <w:lang w:eastAsia="zh-CN"/>
         </w:rPr>
-        <w:lastRenderedPageBreak/>
-        <w:t>7.3</w:t>
-      </w:r>
-      <w:r>
-        <w:rPr>
-          <w:lang w:eastAsia="zh-CN"/>
-        </w:rPr>
-        <w:t xml:space="preserve">　局限</w:t>
+        <w:t>7.4</w:t>
+      </w:r>
+      <w:r>
+        <w:rPr>
+          <w:lang w:eastAsia="zh-CN"/>
+        </w:rPr>
+        <w:t xml:space="preserve">　未来工作</w:t>
       </w:r>
     </w:p>
     <w:p>
@@ -2026,26 +2020,7 @@
         <w:rPr>
           <w:lang w:eastAsia="zh-CN"/>
         </w:rPr>
-        <w:t>7.4</w:t>
-      </w:r>
-      <w:r>
-        <w:rPr>
-          <w:lang w:eastAsia="zh-CN"/>
-        </w:rPr>
-        <w:t xml:space="preserve">　未来工作</w:t>
-      </w:r>
-    </w:p>
-    <w:p>
-      <w:pPr>
-        <w:pStyle w:val="21"/>
-        <w:rPr>
-          <w:lang w:eastAsia="zh-CN"/>
-        </w:rPr>
-      </w:pPr>
-      <w:r>
-        <w:rPr>
-          <w:lang w:eastAsia="zh-CN"/>
-        </w:rPr>
+        <w:lastRenderedPageBreak/>
         <w:t>7.5</w:t>
       </w:r>
       <w:r>
@@ -3031,6 +3006,7 @@
   <w:style w:type="character" w:default="1" w:styleId="a2">
     <w:name w:val="Default Paragraph Font"/>
     <w:uiPriority w:val="1"/>
+    <w:semiHidden/>
     <w:unhideWhenUsed/>
   </w:style>
   <w:style w:type="table" w:default="1" w:styleId="a3">

</xml_diff>